<commit_message>
Restore "illustrative" in the abstract, and disambiguate the Table 1 row label
The abstract rewrite had dropped "illustrative", which Reviewer 2 credited
explicitly. The scenario is named as illustrative again, with the 0.1%
prevalence stated rather than left as "low prevalence". The abstract is now 247
words against the journal's 250 limit, which check_journal_requirements
enforces on every build.

"Ties to no flag (majority)" was ambiguous, since D4 is also a majority rule.
It now reads "Ties to no flag (strict majority)", matching the caption and
Section 2.3.

The longer label pushed Table 1 back over the text block by 9.2pt, because the
first column is sized by its longest entry and this became the longest. The
label stays and \tabcolsep goes from 4pt to 3pt instead, which absorbs it with
no overfull box anywhere in the document and no change of font size.
check_table_agg's row label moved with it.
</commit_message>
<xml_diff>
--- a/paper/manuscript_full.docx
+++ b/paper/manuscript_full.docx
@@ -34,7 +34,7 @@
         <w:pStyle w:val="FirstParagraph"/>
       </w:pPr>
       <w:r>
-        <w:t xml:space="preserve">Large language models (LLMs) are increasingly considered for anti-money-laundering (AML) transaction screening, but the operational consequences of model choice are poorly quantified. We investigate how foundation-model selection affects the screening operating point when the task, cases and evaluation procedure are held fixed. Five off-the-shelf models from two providers were tested as zero-shot screeners on a preregistered, reproducible battery of 600 synthetic transaction cases anchored on established laundering typologies, half suspicious and half hard negatives. For the same 300 legitimate cases, false-positive rates ranged from 2.3% to 85.7%—an 83.3 percentage-point spread (95% confidence interval 71.8 to 93.7 points, cluster bootstrap over eight case-template strata)—and the models disagreed on 88.7% of legitimate cases. Differences were systematic: rates decreased monotonically with model tier within each of the two provider families studied, so lower-tier models over-flagged legitimate activity. The models occupied different points on the sensitivity–specificity trade-off, not merely different accuracy levels. At one million transactions per day under low prevalence, projected daily alert workload differed by 36- to 196-fold across the four deployable single-call configurations and by about 35-fold under the preregistered per-case aggregate, with model ordering invariant across prompts, seeds and prevalence. Foundation-model choice is therefore not merely an AML procurement decision but a core operational risk parameter. Because commercially accessed models may be updated, substituted or retired by providers, model-tier substitution and alias redirection should be treated as first-class model-risk events, and operating-point stability monitored through a standing probe.</w:t>
+        <w:t xml:space="preserve">Large language models (LLMs) are increasingly considered for anti-money-laundering (AML) transaction screening, but the operational consequences of model choice are poorly quantified. We investigate how foundation-model selection affects the screening operating point when the task, cases and evaluation procedure are held fixed. Five off-the-shelf models from two providers were tested as zero-shot screeners on a preregistered, reproducible battery of 600 synthetic transaction cases anchored on established laundering typologies, half suspicious and half hard negatives. For the same 300 legitimate cases, false-positive rates ranged from 2.3% to 85.7%—an 83.3 percentage-point spread (95% confidence interval 71.8 to 93.7 points, cluster bootstrap over eight case-template strata)—and the models disagreed on 88.7% of legitimate cases. Differences were systematic: rates decreased monotonically with model tier within each of the two provider families studied, so lower-tier models over-flagged legitimate activity. The models occupied different points on the sensitivity–specificity trade-off, not merely different accuracy levels. In an illustrative scenario of one million transactions per day at 0.1% prevalence, projected daily alert workload differed by 36- to 196-fold across the four deployable single-call configurations and by about 35-fold under the preregistered per-case aggregate, with model ordering invariant across prompts, seeds and prevalence. Foundation-model choice is therefore not merely an AML procurement decision but a core operational risk parameter. Because commercially accessed models may be updated, substituted or retired by providers, model-tier substitution and alias redirection should be treated as first-class model-risk events, and operating-point stability monitored through a standing probe.</w:t>
       </w:r>
     </w:p>
     <w:p>
@@ -2994,7 +2994,7 @@
               <w:jc w:val="left"/>
             </w:pPr>
             <w:r>
-              <w:t xml:space="preserve">Ties to no flag (majority)</w:t>
+              <w:t xml:space="preserve">Ties to no flag (strict majority)</w:t>
             </w:r>
           </w:p>
         </w:tc>

</xml_diff>

<commit_message>
Cite the Zenodo concept DOI 10.5281/zenodo.23424852
Added to CITATION.cff, .zenodo.json, README (twice), the manuscript's Data
availability statement, the cover letter and the reproducibility document, and
the stale 'minted at archive time' placeholders removed.

The concept DOI is the right identifier because it always resolves to the most
recent version. See the report: the version it currently resolves to is NOT the
revised work.
</commit_message>
<xml_diff>
--- a/paper/manuscript_full.docx
+++ b/paper/manuscript_full.docx
@@ -6747,7 +6747,7 @@
       </w:r>
     </w:p>
     <w:bookmarkEnd w:id="58"/>
-    <w:bookmarkStart w:id="60" w:name="declarations"/>
+    <w:bookmarkStart w:id="61" w:name="declarations"/>
     <w:p>
       <w:pPr>
         <w:pStyle w:val="Heading1"/>
@@ -6824,7 +6824,21 @@
         <w:t xml:space="preserve"> </w:t>
       </w:r>
       <w:r>
-        <w:t xml:space="preserve">under the MIT licence. The repository root includes</w:t>
+        <w:t xml:space="preserve">under the MIT licence, and archived on Zenodo under the concept DOI</w:t>
+      </w:r>
+      <w:r>
+        <w:t xml:space="preserve"> </w:t>
+      </w:r>
+      <w:hyperlink r:id="rId60">
+        <w:r>
+          <w:rPr>
+            <w:rStyle w:val="Hyperlink"/>
+          </w:rPr>
+          <w:t xml:space="preserve">https://doi.org/10.5281/zenodo.23424852</w:t>
+        </w:r>
+      </w:hyperlink>
+      <w:r>
+        <w:t xml:space="preserve">, which resolves to the most recent version. The repository root includes</w:t>
       </w:r>
       <w:r>
         <w:t xml:space="preserve"> </w:t>
@@ -6991,8 +7005,8 @@
         <w:t xml:space="preserve">S.C. 0009-0007-2779-3492, R.C. 0009-0007-2807-3948.</w:t>
       </w:r>
     </w:p>
-    <w:bookmarkEnd w:id="60"/>
-    <w:bookmarkStart w:id="85" w:name="references"/>
+    <w:bookmarkEnd w:id="61"/>
+    <w:bookmarkStart w:id="86" w:name="references"/>
     <w:p>
       <w:pPr>
         <w:pStyle w:val="Heading1"/>
@@ -7014,7 +7028,7 @@
       <w:r>
         <w:t xml:space="preserve"> </w:t>
       </w:r>
-      <w:hyperlink r:id="rId61">
+      <w:hyperlink r:id="rId62">
         <w:r>
           <w:rPr>
             <w:rStyle w:val="Hyperlink"/>
@@ -7036,7 +7050,7 @@
       <w:r>
         <w:t xml:space="preserve"> </w:t>
       </w:r>
-      <w:hyperlink r:id="rId62">
+      <w:hyperlink r:id="rId63">
         <w:r>
           <w:rPr>
             <w:rStyle w:val="Hyperlink"/>
@@ -7099,7 +7113,7 @@
       <w:r>
         <w:t xml:space="preserve"> </w:t>
       </w:r>
-      <w:hyperlink r:id="rId63">
+      <w:hyperlink r:id="rId64">
         <w:r>
           <w:rPr>
             <w:rStyle w:val="Hyperlink"/>
@@ -7121,7 +7135,7 @@
       <w:r>
         <w:t xml:space="preserve"> </w:t>
       </w:r>
-      <w:hyperlink r:id="rId64">
+      <w:hyperlink r:id="rId65">
         <w:r>
           <w:rPr>
             <w:rStyle w:val="Hyperlink"/>
@@ -7220,7 +7234,7 @@
       <w:r>
         <w:t xml:space="preserve"> </w:t>
       </w:r>
-      <w:hyperlink r:id="rId65">
+      <w:hyperlink r:id="rId66">
         <w:r>
           <w:rPr>
             <w:rStyle w:val="Hyperlink"/>
@@ -7242,7 +7256,7 @@
       <w:r>
         <w:t xml:space="preserve"> </w:t>
       </w:r>
-      <w:hyperlink r:id="rId66">
+      <w:hyperlink r:id="rId67">
         <w:r>
           <w:rPr>
             <w:rStyle w:val="Hyperlink"/>
@@ -7264,7 +7278,7 @@
       <w:r>
         <w:t xml:space="preserve"> </w:t>
       </w:r>
-      <w:hyperlink r:id="rId67">
+      <w:hyperlink r:id="rId68">
         <w:r>
           <w:rPr>
             <w:rStyle w:val="Hyperlink"/>
@@ -7286,7 +7300,7 @@
       <w:r>
         <w:t xml:space="preserve"> </w:t>
       </w:r>
-      <w:hyperlink r:id="rId68">
+      <w:hyperlink r:id="rId69">
         <w:r>
           <w:rPr>
             <w:rStyle w:val="Hyperlink"/>
@@ -7308,7 +7322,7 @@
       <w:r>
         <w:t xml:space="preserve"> </w:t>
       </w:r>
-      <w:hyperlink r:id="rId69">
+      <w:hyperlink r:id="rId70">
         <w:r>
           <w:rPr>
             <w:rStyle w:val="Hyperlink"/>
@@ -7393,7 +7407,7 @@
       <w:r>
         <w:t xml:space="preserve"> </w:t>
       </w:r>
-      <w:hyperlink r:id="rId70">
+      <w:hyperlink r:id="rId71">
         <w:r>
           <w:rPr>
             <w:rStyle w:val="Hyperlink"/>
@@ -7415,7 +7429,7 @@
       <w:r>
         <w:t xml:space="preserve"> </w:t>
       </w:r>
-      <w:hyperlink r:id="rId71">
+      <w:hyperlink r:id="rId72">
         <w:r>
           <w:rPr>
             <w:rStyle w:val="Hyperlink"/>
@@ -7478,7 +7492,7 @@
       <w:r>
         <w:t xml:space="preserve"> </w:t>
       </w:r>
-      <w:hyperlink r:id="rId72">
+      <w:hyperlink r:id="rId73">
         <w:r>
           <w:rPr>
             <w:rStyle w:val="Hyperlink"/>
@@ -7500,7 +7514,7 @@
       <w:r>
         <w:t xml:space="preserve"> </w:t>
       </w:r>
-      <w:hyperlink r:id="rId73">
+      <w:hyperlink r:id="rId74">
         <w:r>
           <w:rPr>
             <w:rStyle w:val="Hyperlink"/>
@@ -7528,7 +7542,7 @@
       <w:r>
         <w:t xml:space="preserve"> </w:t>
       </w:r>
-      <w:hyperlink r:id="rId74">
+      <w:hyperlink r:id="rId75">
         <w:r>
           <w:rPr>
             <w:rStyle w:val="Hyperlink"/>
@@ -7556,7 +7570,7 @@
       <w:r>
         <w:t xml:space="preserve"> </w:t>
       </w:r>
-      <w:hyperlink r:id="rId75">
+      <w:hyperlink r:id="rId76">
         <w:r>
           <w:rPr>
             <w:rStyle w:val="Hyperlink"/>
@@ -7578,7 +7592,7 @@
       <w:r>
         <w:t xml:space="preserve"> </w:t>
       </w:r>
-      <w:hyperlink r:id="rId76">
+      <w:hyperlink r:id="rId77">
         <w:r>
           <w:rPr>
             <w:rStyle w:val="Hyperlink"/>
@@ -7622,7 +7636,7 @@
       <w:r>
         <w:t xml:space="preserve"> </w:t>
       </w:r>
-      <w:hyperlink r:id="rId77">
+      <w:hyperlink r:id="rId78">
         <w:r>
           <w:rPr>
             <w:rStyle w:val="Hyperlink"/>
@@ -7644,7 +7658,7 @@
       <w:r>
         <w:t xml:space="preserve"> </w:t>
       </w:r>
-      <w:hyperlink r:id="rId78">
+      <w:hyperlink r:id="rId79">
         <w:r>
           <w:rPr>
             <w:rStyle w:val="Hyperlink"/>
@@ -7666,7 +7680,7 @@
       <w:r>
         <w:t xml:space="preserve"> </w:t>
       </w:r>
-      <w:hyperlink r:id="rId79">
+      <w:hyperlink r:id="rId80">
         <w:r>
           <w:rPr>
             <w:rStyle w:val="Hyperlink"/>
@@ -7812,7 +7826,7 @@
       <w:r>
         <w:t xml:space="preserve"> </w:t>
       </w:r>
-      <w:hyperlink r:id="rId80">
+      <w:hyperlink r:id="rId81">
         <w:r>
           <w:rPr>
             <w:rStyle w:val="Hyperlink"/>
@@ -7846,7 +7860,7 @@
       <w:r>
         <w:t xml:space="preserve"> </w:t>
       </w:r>
-      <w:hyperlink r:id="rId81">
+      <w:hyperlink r:id="rId82">
         <w:r>
           <w:rPr>
             <w:rStyle w:val="Hyperlink"/>
@@ -7895,7 +7909,7 @@
       <w:r>
         <w:t xml:space="preserve"> </w:t>
       </w:r>
-      <w:hyperlink r:id="rId82">
+      <w:hyperlink r:id="rId83">
         <w:r>
           <w:rPr>
             <w:rStyle w:val="Hyperlink"/>
@@ -7967,7 +7981,7 @@
       <w:r>
         <w:t xml:space="preserve"> </w:t>
       </w:r>
-      <w:hyperlink r:id="rId83">
+      <w:hyperlink r:id="rId84">
         <w:r>
           <w:rPr>
             <w:rStyle w:val="Hyperlink"/>
@@ -7989,7 +8003,7 @@
       <w:r>
         <w:t xml:space="preserve"> </w:t>
       </w:r>
-      <w:hyperlink r:id="rId84">
+      <w:hyperlink r:id="rId85">
         <w:r>
           <w:rPr>
             <w:rStyle w:val="Hyperlink"/>
@@ -7998,7 +8012,7 @@
         </w:r>
       </w:hyperlink>
     </w:p>
-    <w:bookmarkEnd w:id="85"/>
+    <w:bookmarkEnd w:id="86"/>
     <w:sectPr>
       <w:footnotePr>
         <w:numRestart w:val="eachSect"/>

</xml_diff>

<commit_message>
docx: rebuild the author byline pandoc silently drops
pandoc does not know Springer's \author[n]{\fnm{..} \sur{..}} or \affil[n]{\orgname{..}},
so \maketitle rendered the title alone and both authors vanished from the .docx without any
error -- the same silent-drop class the module already guards for \HLtext. The journal
returned the submission for having no author names.

make_docx.py now rebuilds the byline, affiliation and corresponding author from the source
and injects them alongside the abstract, then reads the built .docx back and fails the build
if any author's name is missing from its first 4000 characters. Author arguments are matched
by counting braces, since a non-greedy regex stops inside \fnm{..} and yields first names only.
</commit_message>
<xml_diff>
--- a/paper/manuscript_full.docx
+++ b/paper/manuscript_full.docx
@@ -19,6 +19,34 @@
       <w:pPr>
         <w:pStyle w:val="Author"/>
       </w:pPr>
+    </w:p>
+    <w:p>
+      <w:pPr>
+        <w:pStyle w:val="FirstParagraph"/>
+      </w:pPr>
+      <w:r>
+        <w:rPr>
+          <w:b/>
+          <w:bCs/>
+        </w:rPr>
+        <w:t xml:space="preserve">Samir Chincholikar, Robin Chawla</w:t>
+      </w:r>
+    </w:p>
+    <w:p>
+      <w:pPr>
+        <w:pStyle w:val="BodyText"/>
+      </w:pPr>
+      <w:r>
+        <w:t xml:space="preserve">Independent Researcher</w:t>
+      </w:r>
+    </w:p>
+    <w:p>
+      <w:pPr>
+        <w:pStyle w:val="BodyText"/>
+      </w:pPr>
+      <w:r>
+        <w:t xml:space="preserve">Corresponding author: Robin Chawla (robin.chawla.cse14@iitbhu.ac.in)</w:t>
+      </w:r>
     </w:p>
     <w:bookmarkStart w:id="9" w:name="abstract"/>
     <w:p>

</xml_diff>

<commit_message>
Reword the two compounds that needed rewriting, not de-hyphenating
production-bank (x6) was doing the work of a prepositional phrase: 'absolute production-bank
false-positive or miss rates' becomes 'absolute false-positive or miss rates in production',
'estimates of production-bank performance' becomes 'estimates of performance in production',
and 'confidential production-bank records' becomes 'confidential records from a production
bank'. The contribution heading 'A foundation-model-swap interpretation of model governance'
becomes 'Model substitution as a governance event', which drops a triple compound and the
second 'model' in one line.

Abstract untouched, so the 248-word count stands.
</commit_message>
<xml_diff>
--- a/paper/manuscript_full.docx
+++ b/paper/manuscript_full.docx
@@ -193,7 +193,7 @@
         <w:pStyle w:val="BodyText"/>
       </w:pPr>
       <w:r>
-        <w:t xml:space="preserve">To this end, we evaluate five commercially available foundation models from two providers as zero-shot AML screeners on a common, preregistered battery of 600 synthetic transaction cases based on recognised Financial Action Task Force (FATF) laundering typologies and established synthetic-AML data structures [34, 41]. The battery includes 300 suspicious cases drawn from eight laundering typologies and 300 legitimate hard-negative cases that resemble typical alert-generating patterns. Synthetic cases with complete ground-truth labels, controlled variation, identical inputs across models and full reproducibility are used deliberately. The goal is thus not to estimate absolute production-bank false-positive or miss rates, but to measure the change in operating point between models for fixed underlying cases.</w:t>
+        <w:t xml:space="preserve">To this end, we evaluate five commercially available foundation models from two providers as zero-shot AML screeners on a common, preregistered battery of 600 synthetic transaction cases based on recognised Financial Action Task Force (FATF) laundering typologies and established synthetic-AML data structures [34, 41]. The battery includes 300 suspicious cases drawn from eight laundering typologies and 300 legitimate hard-negative cases that resemble typical alert-generating patterns. Synthetic cases with complete ground-truth labels, controlled variation, identical inputs across models and full reproducibility are used deliberately. The goal is thus not to estimate absolute false-positive or miss rates in production, but to measure the change in operating point between models for fixed underlying cases.</w:t>
       </w:r>
     </w:p>
     <w:p>
@@ -224,7 +224,7 @@
           <w:i/>
           <w:iCs/>
         </w:rPr>
-        <w:t xml:space="preserve">A foundation-model-swap interpretation of model governance.</w:t>
+        <w:t xml:space="preserve">Model substitution as a governance event.</w:t>
       </w:r>
       <w:r>
         <w:t xml:space="preserve"> </w:t>
@@ -351,7 +351,7 @@
         <w:pStyle w:val="FirstParagraph"/>
       </w:pPr>
       <w:r>
-        <w:t xml:space="preserve">The study was designed to isolate the effect of foundation-model identity on AML screening decisions. All evaluated models were therefore given the same transaction cases under the same screening task, while the underlying foundation model was varied. The goal was not to estimate production-bank false-positive or miss rates, but to quantify how much the screening operating point changes when the model is changed and the transaction evidence is held constant.</w:t>
+        <w:t xml:space="preserve">The study was designed to isolate the effect of foundation-model identity on AML screening decisions. All evaluated models were therefore given the same transaction cases under the same screening task, while the underlying foundation model was varied. The goal was not to estimate false-positive or miss rates in production, but to quantify how much the screening operating point changes when the model is changed and the transaction evidence is held constant.</w:t>
       </w:r>
     </w:p>
     <w:p>
@@ -395,7 +395,7 @@
         <w:pStyle w:val="BodyText"/>
       </w:pPr>
       <w:r>
-        <w:t xml:space="preserve">The use of synthetic data was an intentional, controlled design choice. Real-world AML transaction data with complete ground-truth labels is extremely limited, and confirmed real-world labels are inherently incomplete because undetected laundering cannot be presented as a known positive case. The synthetic battery allows full labelling, submission of the same cases to all evaluated models, control over the presence of typology-specific signals, and complete reproducibility. The measured absolute error rates are therefore properties of this controlled evaluation battery, not estimates of production-bank performance. The primary estimand is the difference between models in screening behaviour on identical cases.</w:t>
+        <w:t xml:space="preserve">The use of synthetic data was an intentional, controlled design choice. Real-world AML transaction data with complete ground-truth labels is extremely limited, and confirmed real-world labels are inherently incomplete because undetected laundering cannot be presented as a known positive case. The synthetic battery allows full labelling, submission of the same cases to all evaluated models, control over the presence of typology-specific signals, and complete reproducibility. The measured absolute error rates are therefore properties of this controlled evaluation battery, not estimates of performance in production. The primary estimand is the difference between models in screening behaviour on identical cases.</w:t>
       </w:r>
     </w:p>
     <w:p>
@@ -2388,13 +2388,13 @@
         <w:pStyle w:val="FirstParagraph"/>
       </w:pPr>
       <w:r>
-        <w:t xml:space="preserve">Several limitations should be considered when interpreting these results. First, the experiment is built around a synthetic transaction battery rather than confidential production-bank records. This is a deliberate methodological choice reflecting the limited accessibility of AML data and the requirements of controlled comparison. Real AML transaction data is rarely publicly available because of privacy, confidentiality, regulatory and re-identification concerns [23], and suspicious-transaction information carries additional safeguards: FATF Recommendation 21 requires countries to prohibit by law the disclosure (</w:t>
+        <w:t xml:space="preserve">Several limitations should be considered when interpreting these results. First, the experiment is built around a synthetic transaction battery rather than confidential records from a production bank. This is a deliberate methodological choice reflecting the limited accessibility of AML data and the requirements of controlled comparison. Real AML transaction data is rarely publicly available because of privacy, confidentiality, regulatory and re-identification concerns [23], and suspicious-transaction information carries additional safeguards: FATF Recommendation 21 requires countries to prohibit by law the disclosure (</w:t>
       </w:r>
       <w:r>
         <w:t xml:space="preserve">“tipping-off”</w:t>
       </w:r>
       <w:r>
-        <w:t xml:space="preserve">) that a suspicious transaction report or related information is being filed [16], and the pooling of financial data for AML analytics must be reconciled with privacy and data-protection requirements [17]. Moreover, real-world ground truth is necessarily incomplete: laundering that is never detected cannot appear as a confirmed positive case [3]. A deterministic synthetic battery therefore offers an important experimental advantage for the present research question by providing full labels and allowing each model to be evaluated on exactly the same underlying cases. The trade-off is between ecological realism and experimental control. The absolute false-positive and miss rates reported here should not be interpreted as estimates of production-bank performance. The relevant estimand is the relative change in operating point as the foundation model is varied while the screening cases are held constant. Replication on other independently constructed batteries or suitable confidential institutional datasets would help assess the generality of the observed divergence, but the absence of such data does not affect the controlled comparison reported here.</w:t>
+        <w:t xml:space="preserve">) that a suspicious transaction report or related information is being filed [16], and the pooling of financial data for AML analytics must be reconciled with privacy and data-protection requirements [17]. Moreover, real-world ground truth is necessarily incomplete: laundering that is never detected cannot appear as a confirmed positive case [3]. A deterministic synthetic battery therefore offers an important experimental advantage for the present research question by providing full labels and allowing each model to be evaluated on exactly the same underlying cases. The trade-off is between ecological realism and experimental control. The absolute false-positive and miss rates reported here should not be interpreted as estimates of performance in production. The relevant estimand is the relative change in operating point as the foundation model is varied while the screening cases are held constant. Replication on other independently constructed batteries or suitable confidential institutional datasets would help assess the generality of the observed divergence, but the absence of such data does not affect the controlled comparison reported here.</w:t>
       </w:r>
     </w:p>
     <w:p>
@@ -2609,7 +2609,7 @@
         <w:pStyle w:val="BodyText"/>
       </w:pPr>
       <w:r>
-        <w:t xml:space="preserve">The controlled experiment in this study used a synthetic design to measure this between-model effect under identical and fully labelled conditions. The absolute error rates reported are not estimates of production-bank performance, but they show that model identity alone can produce substantial differences in screening behaviour. Further replication across providers, model families and suitable institutional datasets would help establish how far the magnitude of this divergence generalises. Overall, the results reframe the question from whether foundation models are capable of AML screening to whether the particular foundation model underpinning a screening system can be treated as a stable, interchangeable component. The evidence presented here shows that interchangeability cannot be assumed: foundation-model selection and substitution should be treated as first-class model risk events, with their resulting operating points explicitly measured, documented and monitored throughout the lifecycle of an AML screening system.</w:t>
+        <w:t xml:space="preserve">The controlled experiment in this study used a synthetic design to measure this between-model effect under identical and fully labelled conditions. The absolute error rates reported are not estimates of performance in production, but they show that model identity alone can produce substantial differences in screening behaviour. Further replication across providers, model families and suitable institutional datasets would help establish how far the magnitude of this divergence generalises. Overall, the results reframe the question from whether foundation models are capable of AML screening to whether the particular foundation model underpinning a screening system can be treated as a stable, interchangeable component. The evidence presented here shows that interchangeability cannot be assumed: foundation-model selection and substitution should be treated as first-class model risk events, with their resulting operating points explicitly measured, documented and monitored throughout the lifecycle of an AML screening system.</w:t>
       </w:r>
     </w:p>
     <w:bookmarkStart w:id="28" w:name="tab:agg"/>

</xml_diff>